<commit_message>
Veri ayrıştırma hatalarını düzelt, paketi ve örnek çıktıları yenile
- Yıl aralıkları artık kazanım koduna yutulmuyor (TAR.10.2.2 | 1299-1453 …)
- Boşluksuz madde numaraları (1.Peygamberi…) metinden ayrılıyor
- Metin içine gömülü kazanım kodları ayrı kazanımlara bölünüyor
- Eksik boşluk (SayılardaTanımlı) ve satır sonu tirelemesi (kul-lanacağını) düzeltildi
- Biyoloji 11'deki yapay "TEPKİ HOMEOSTAZİ" ünitesi kaldırıldı
- Otomatik dağıtılan seçmeli derslerde konu, TYMM içerik çerçevesi başlıklarından alınıyor
- Baştaki tire, "..", CSV tırnağı, yapışık madde imi gibi artıklar temizlendi
- tools/veri_denetle.js: veri kalitesi denetimi (eski veride 1425 ihlal, yeni veride 0)
- Tek dosyalık paket ve örnek Word çıktıları yeni üreticiyle yenilendi

Co-Authored-By: Claude Opus 5.5 <noreply@anthropic.com>
Claude-Session: https://claude.ai/code/session_01APr7gL8YXcH56hb2LLW1Uh
</commit_message>
<xml_diff>
--- a/ornek_cikti/Ornek_12_Sinif_Turk_Dili_ve_Edebiyati_BEP_Plani.docx
+++ b/ornek_cikti/Ornek_12_Sinif_Turk_Dili_ve_Edebiyati_BEP_Plani.docx
@@ -522,7 +522,7 @@
                 <w:sz w:val="15"/>
                 <w:szCs w:val="15"/>
               </w:rPr>
-              <w:t xml:space="preserve">Türk Dili ve Edebiyatı (5 Saat) / 1 Yıl (36 Öğretim Haftası)</w:t>
+              <w:t xml:space="preserve">Türk Dili ve Edebiyatı (4 Saat) / 1 Yıl (36 Öğretim Haftası)</w:t>
             </w:r>
           </w:p>
         </w:tc>
@@ -1260,6 +1260,24 @@
     <w:p>
       <w:pPr>
         <w:keepNext/>
+        <w:spacing w:before="0" w:after="20" w:line="240" w:lineRule="auto"/>
+        <w:jc w:val="left"/>
+      </w:pPr>
+      <w:r>
+        <w:rPr>
+          <w:rFonts w:ascii="Calibri" w:hAnsi="Calibri" w:eastAsia="Calibri" w:cs="Calibri"/>
+          <w:i/>
+          <w:iCs/>
+          <w:color w:val="4A5568"/>
+          <w:sz w:val="16"/>
+          <w:szCs w:val="16"/>
+        </w:rPr>
+        <w:t xml:space="preserve">MEB 2026-2027 Çalışma Takvimi ve MEB OGM 2026-2027 Taslak Çerçeve Yıllık Planı esas alınarak hazırlanmıştır • Aylar gruplandırılmış ve kalın çizgilerle belirginleştirilmiştir (36 öğretim haftası / 144 ders saati)</w:t>
+      </w:r>
+    </w:p>
+    <w:p>
+      <w:pPr>
+        <w:keepNext/>
         <w:spacing w:before="0" w:after="60" w:line="240" w:lineRule="auto"/>
         <w:jc w:val="left"/>
       </w:pPr>
@@ -1272,7 +1290,7 @@
           <w:sz w:val="16"/>
           <w:szCs w:val="16"/>
         </w:rPr>
-        <w:t xml:space="preserve">MEB 2026-2027 Çalışma Takvimi ve MEB OGM 2026-2027 Taslak Çerçeve Yıllık Planı esas alınarak hazırlanmıştır • Aylar gruplandırılmış ve kalın çizgilerle belirginleştirilmiştir (36 öğretim haftası / 180 ders saati)</w:t>
+        <w:t xml:space="preserve">Açıklama: Her uzun dönemli amacın (UDA) cümlesi, o UDA'nın ilk haftasında “BEP Amaçları” sütununda yer alır; kısa dönemli amaçlar (KDA) ilgili UDA'nın numarasıyla (UDA n / KDA n.m) haftalara dağıtılmıştır. Aynı kazanımın sürdüğü haftalarda KDA'lar ön koşul beceriden başlayarak ipucunun azaltıldığı ve farklı örneklere genellendiği basamaklarla ilerler. Okul temelli planlama ve sosyal etkinlik haftalarındaki amaçlar bir UDA'ya bağlı değildir; bu haftalarda öğrencinin etkinliklere akranlarıyla katılımı hedeflenir.</w:t>
       </w:r>
     </w:p>
     <w:tbl>
@@ -1721,7 +1739,7 @@
                 <w:sz w:val="15"/>
                 <w:szCs w:val="15"/>
               </w:rPr>
-              <w:t xml:space="preserve">5</w:t>
+              <w:t xml:space="preserve">4</w:t>
             </w:r>
           </w:p>
         </w:tc>
@@ -1800,18 +1818,47 @@
           <w:p>
             <w:pPr>
               <w:keepNext/>
-              <w:spacing w:before="0" w:after="10" w:line="240" w:lineRule="auto"/>
-              <w:jc w:val="left"/>
-            </w:pPr>
-            <w:r>
-              <w:rPr>
-                <w:rFonts w:ascii="Calibri" w:hAnsi="Calibri" w:eastAsia="Calibri" w:cs="Calibri"/>
-                <w:b/>
-                <w:bCs/>
+              <w:spacing w:before="0" w:after="40" w:line="240" w:lineRule="auto"/>
+              <w:jc w:val="left"/>
+            </w:pPr>
+            <w:r>
+              <w:rPr>
+                <w:rFonts w:ascii="Calibri" w:hAnsi="Calibri" w:eastAsia="Calibri" w:cs="Calibri"/>
+                <w:b/>
+                <w:bCs/>
+                <w:color w:val="2B6CB0"/>
+                <w:sz w:val="14"/>
+                <w:szCs w:val="14"/>
+              </w:rPr>
+              <w:t xml:space="preserve">UDA 1: </w:t>
+            </w:r>
+            <w:r>
+              <w:rPr>
+                <w:rFonts w:ascii="Calibri" w:hAnsi="Calibri" w:eastAsia="Calibri" w:cs="Calibri"/>
+                <w:i/>
+                <w:iCs/>
                 <w:color w:val="1B365D"/>
                 <w:sz w:val="14"/>
                 <w:szCs w:val="14"/>
               </w:rPr>
+              <w:t xml:space="preserve">Deniz, edebiyatın diğer disiplinlerle ilişkisini ve dilin tarihsel gelişimini sadeleştirilmiş metinler ve örnekler üzerinden açıklar.</w:t>
+            </w:r>
+          </w:p>
+          <w:p>
+            <w:pPr>
+              <w:keepNext/>
+              <w:spacing w:before="0" w:after="10" w:line="240" w:lineRule="auto"/>
+              <w:jc w:val="left"/>
+            </w:pPr>
+            <w:r>
+              <w:rPr>
+                <w:rFonts w:ascii="Calibri" w:hAnsi="Calibri" w:eastAsia="Calibri" w:cs="Calibri"/>
+                <w:b/>
+                <w:bCs/>
+                <w:color w:val="1B365D"/>
+                <w:sz w:val="14"/>
+                <w:szCs w:val="14"/>
+              </w:rPr>
               <w:t xml:space="preserve">UDA 1 / KDA 1.1: </w:t>
             </w:r>
             <w:r>
@@ -1821,7 +1868,7 @@
                 <w:sz w:val="14"/>
                 <w:szCs w:val="14"/>
               </w:rPr>
-              <w:t xml:space="preserve">Deniz, yönlendirici sorular sorulduğunda “Giriş” ünitesi kapsamındaki sadeleştirilmiş bir metni okuyarak konusunu ve ana fikrini söyler. (Ölçüt: %80 – 4/5)</w:t>
+              <w:t xml:space="preserve">Deniz, yönlendirici sorular sorulduğunda “Giriş” ünitesi kapsamındaki metinlerde geçen anahtar kelimelerin anlamlarını örnek cümlelerle eşleştirir. (Ölçüt: %80 – 4/5)</w:t>
             </w:r>
           </w:p>
         </w:tc>
@@ -2022,7 +2069,7 @@
                 <w:sz w:val="15"/>
                 <w:szCs w:val="15"/>
               </w:rPr>
-              <w:t xml:space="preserve">5</w:t>
+              <w:t xml:space="preserve">4</w:t>
             </w:r>
           </w:p>
         </w:tc>
@@ -2122,7 +2169,7 @@
                 <w:sz w:val="14"/>
                 <w:szCs w:val="14"/>
               </w:rPr>
-              <w:t xml:space="preserve">Deniz, sadeleştirilmiş materyal verildiğinde “Giriş” ünitesi kapsamında verilen yazma şablonunu kullanarak üç-dört cümlelik bir metin yazar. (Ölçüt: %80 – 4/5)</w:t>
+              <w:t xml:space="preserve">Deniz, sadeleştirilmiş materyal verildiğinde “Giriş” ünitesi kapsamında öğrendiklerini kısa bir sözlü ya da yazılı anlatımla paylaşır. (Ölçüt: %80 – 4/5)</w:t>
             </w:r>
           </w:p>
         </w:tc>
@@ -2327,7 +2374,7 @@
                 <w:sz w:val="15"/>
                 <w:szCs w:val="15"/>
               </w:rPr>
-              <w:t xml:space="preserve">5</w:t>
+              <w:t xml:space="preserve">4</w:t>
             </w:r>
           </w:p>
         </w:tc>
@@ -2421,6 +2468,34 @@
             </w:tcMar>
             <w:vAlign w:val="center"/>
           </w:tcPr>
+          <w:p>
+            <w:pPr>
+              <w:spacing w:before="0" w:after="40" w:line="240" w:lineRule="auto"/>
+              <w:jc w:val="left"/>
+            </w:pPr>
+            <w:r>
+              <w:rPr>
+                <w:rFonts w:ascii="Calibri" w:hAnsi="Calibri" w:eastAsia="Calibri" w:cs="Calibri"/>
+                <w:b/>
+                <w:bCs/>
+                <w:color w:val="2B6CB0"/>
+                <w:sz w:val="14"/>
+                <w:szCs w:val="14"/>
+              </w:rPr>
+              <w:t xml:space="preserve">UDA 2: </w:t>
+            </w:r>
+            <w:r>
+              <w:rPr>
+                <w:rFonts w:ascii="Calibri" w:hAnsi="Calibri" w:eastAsia="Calibri" w:cs="Calibri"/>
+                <w:i/>
+                <w:iCs/>
+                <w:color w:val="1B365D"/>
+                <w:sz w:val="14"/>
+                <w:szCs w:val="14"/>
+              </w:rPr>
+              <w:t xml:space="preserve">Deniz, “Hikâye” ünitesindeki sadeleştirilmiş metinleri okur; türün temel özelliklerini örnekler üzerinden açıklar ve bu türde kısa metinler oluşturur.</w:t>
+            </w:r>
+          </w:p>
           <w:p>
             <w:pPr>
               <w:spacing w:before="0" w:after="10" w:line="240" w:lineRule="auto"/>
@@ -2656,7 +2731,7 @@
                 <w:sz w:val="15"/>
                 <w:szCs w:val="15"/>
               </w:rPr>
-              <w:t xml:space="preserve">5</w:t>
+              <w:t xml:space="preserve">4</w:t>
             </w:r>
           </w:p>
         </w:tc>
@@ -2949,7 +3024,7 @@
                 <w:sz w:val="15"/>
                 <w:szCs w:val="15"/>
               </w:rPr>
-              <w:t xml:space="preserve">5</w:t>
+              <w:t xml:space="preserve">4</w:t>
             </w:r>
           </w:p>
         </w:tc>
@@ -3242,7 +3317,7 @@
                 <w:sz w:val="15"/>
                 <w:szCs w:val="15"/>
               </w:rPr>
-              <w:t xml:space="preserve">5</w:t>
+              <w:t xml:space="preserve">4</w:t>
             </w:r>
           </w:p>
         </w:tc>
@@ -3547,7 +3622,7 @@
                 <w:sz w:val="15"/>
                 <w:szCs w:val="15"/>
               </w:rPr>
-              <w:t xml:space="preserve">5</w:t>
+              <w:t xml:space="preserve">4</w:t>
             </w:r>
           </w:p>
         </w:tc>
@@ -3662,7 +3737,7 @@
                 <w:sz w:val="14"/>
                 <w:szCs w:val="14"/>
               </w:rPr>
-              <w:t xml:space="preserve">Deniz, görsel ipuçlarıyla desteklendiğinde “Hikâye” ünitesi kapsamında verilen yazma şablonunu kullanarak üç-dört cümlelik bir metin yazar. (Ölçüt: %80 – 4/5)</w:t>
+              <w:t xml:space="preserve">Deniz, görsel ipuçlarıyla desteklendiğinde ““Hikâye”” ünitesi kapsamında verilen yazma şablonunu kullanarak üç-dört cümlelik bir metin yazar. (Ölçüt: %80 – 4/5)</w:t>
             </w:r>
           </w:p>
         </w:tc>
@@ -3898,7 +3973,7 @@
                 <w:sz w:val="15"/>
                 <w:szCs w:val="15"/>
               </w:rPr>
-              <w:t xml:space="preserve">5</w:t>
+              <w:t xml:space="preserve">4</w:t>
             </w:r>
           </w:p>
         </w:tc>
@@ -4001,7 +4076,7 @@
                 <w:sz w:val="14"/>
                 <w:szCs w:val="14"/>
               </w:rPr>
-              <w:t xml:space="preserve">Deniz, kısa bir sözel ipucu verildiğinde “Hikâye” ünitesi kapsamında verilen yazma şablonunu kullanarak üç-dört cümlelik bir metin yazar. (Ölçüt: %80 – 4/5)</w:t>
+              <w:t xml:space="preserve">Deniz, görsel ipuçlarıyla desteklendiğinde “Hikâye” ünitesi kapsamındaki sadeleştirilmiş bir metni okuyarak konusunu ve ana fikrini söyler. (Ölçüt: %80 – 4/5)</w:t>
             </w:r>
           </w:p>
         </w:tc>
@@ -4218,7 +4293,7 @@
                 <w:sz w:val="15"/>
                 <w:szCs w:val="15"/>
               </w:rPr>
-              <w:t xml:space="preserve">5</w:t>
+              <w:t xml:space="preserve">4</w:t>
             </w:r>
           </w:p>
         </w:tc>
@@ -4318,7 +4393,7 @@
                 <w:sz w:val="14"/>
                 <w:szCs w:val="14"/>
               </w:rPr>
-              <w:t xml:space="preserve">Deniz, sadeleştirilmiş materyal verildiğinde “Hikâye” ünitesi kapsamında hazırlık yaptığı bir-iki dakikalık kısa bir konuşmayı sınıf önünde sunar. (Ölçüt: %80 – 4/5)</w:t>
+              <w:t xml:space="preserve">Deniz, sadeleştirilmiş materyal verildiğinde “Hikâye” ünitesi kapsamında öğrendiklerini kısa bir sözlü ya da yazılı anlatımla paylaşır. (Ölçüt: %80 – 4/5)</w:t>
             </w:r>
           </w:p>
         </w:tc>
@@ -4809,7 +4884,7 @@
                 <w:sz w:val="15"/>
                 <w:szCs w:val="15"/>
               </w:rPr>
-              <w:t xml:space="preserve">5</w:t>
+              <w:t xml:space="preserve">4</w:t>
             </w:r>
           </w:p>
         </w:tc>
@@ -4905,18 +4980,46 @@
           </w:tcPr>
           <w:p>
             <w:pPr>
-              <w:spacing w:before="0" w:after="10" w:line="240" w:lineRule="auto"/>
-              <w:jc w:val="left"/>
-            </w:pPr>
-            <w:r>
-              <w:rPr>
-                <w:rFonts w:ascii="Calibri" w:hAnsi="Calibri" w:eastAsia="Calibri" w:cs="Calibri"/>
-                <w:b/>
-                <w:bCs/>
+              <w:spacing w:before="0" w:after="40" w:line="240" w:lineRule="auto"/>
+              <w:jc w:val="left"/>
+            </w:pPr>
+            <w:r>
+              <w:rPr>
+                <w:rFonts w:ascii="Calibri" w:hAnsi="Calibri" w:eastAsia="Calibri" w:cs="Calibri"/>
+                <w:b/>
+                <w:bCs/>
+                <w:color w:val="2B6CB0"/>
+                <w:sz w:val="14"/>
+                <w:szCs w:val="14"/>
+              </w:rPr>
+              <w:t xml:space="preserve">UDA 3: </w:t>
+            </w:r>
+            <w:r>
+              <w:rPr>
+                <w:rFonts w:ascii="Calibri" w:hAnsi="Calibri" w:eastAsia="Calibri" w:cs="Calibri"/>
+                <w:i/>
+                <w:iCs/>
                 <w:color w:val="1B365D"/>
                 <w:sz w:val="14"/>
                 <w:szCs w:val="14"/>
               </w:rPr>
+              <w:t xml:space="preserve">Deniz, “Şiir” ünitesindeki sadeleştirilmiş metinleri okur; türün temel özelliklerini örnekler üzerinden açıklar ve bu türde kısa metinler oluşturur.</w:t>
+            </w:r>
+          </w:p>
+          <w:p>
+            <w:pPr>
+              <w:spacing w:before="0" w:after="10" w:line="240" w:lineRule="auto"/>
+              <w:jc w:val="left"/>
+            </w:pPr>
+            <w:r>
+              <w:rPr>
+                <w:rFonts w:ascii="Calibri" w:hAnsi="Calibri" w:eastAsia="Calibri" w:cs="Calibri"/>
+                <w:b/>
+                <w:bCs/>
+                <w:color w:val="1B365D"/>
+                <w:sz w:val="14"/>
+                <w:szCs w:val="14"/>
+              </w:rPr>
               <w:t xml:space="preserve">UDA 3 / KDA 3.1: </w:t>
             </w:r>
             <w:r>
@@ -4926,7 +5029,7 @@
                 <w:sz w:val="14"/>
                 <w:szCs w:val="14"/>
               </w:rPr>
-              <w:t xml:space="preserve">Deniz, görsel ipuçlarıyla desteklendiğinde şiirin temasını belirler. (Ölçüt: %80 – 4/5)</w:t>
+              <w:t xml:space="preserve">Deniz, görsel ipuçlarıyla desteklendiğinde “Şiir” ünitesi kapsamındaki metinlerde geçen anahtar kelimelerin anlamlarını örnek cümlelerle eşleştirir. (Ölçüt: %80 – 4/5)</w:t>
             </w:r>
           </w:p>
         </w:tc>
@@ -5045,6 +5148,7 @@
           <w:p>
             <w:pPr>
               <w:keepNext/>
+              <w:pageBreakBefore/>
               <w:spacing w:before="0" w:after="10" w:line="240" w:lineRule="auto"/>
               <w:jc w:val="center"/>
             </w:pPr>
@@ -5076,6 +5180,7 @@
           <w:p>
             <w:pPr>
               <w:keepNext/>
+              <w:pageBreakBefore/>
               <w:spacing w:before="0" w:after="10" w:line="240" w:lineRule="auto"/>
               <w:jc w:val="center"/>
             </w:pPr>
@@ -5107,6 +5212,7 @@
           <w:p>
             <w:pPr>
               <w:keepNext/>
+              <w:pageBreakBefore/>
               <w:spacing w:before="0" w:after="10" w:line="240" w:lineRule="auto"/>
               <w:jc w:val="center"/>
             </w:pPr>
@@ -5136,6 +5242,7 @@
           <w:p>
             <w:pPr>
               <w:keepNext/>
+              <w:pageBreakBefore/>
               <w:spacing w:before="0" w:after="10" w:line="240" w:lineRule="auto"/>
               <w:jc w:val="center"/>
             </w:pPr>
@@ -5148,7 +5255,7 @@
                 <w:sz w:val="15"/>
                 <w:szCs w:val="15"/>
               </w:rPr>
-              <w:t xml:space="preserve">5</w:t>
+              <w:t xml:space="preserve">4</w:t>
             </w:r>
           </w:p>
         </w:tc>
@@ -5167,6 +5274,7 @@
           <w:p>
             <w:pPr>
               <w:keepNext/>
+              <w:pageBreakBefore/>
               <w:spacing w:before="0" w:after="10" w:line="240" w:lineRule="auto"/>
               <w:jc w:val="left"/>
             </w:pPr>
@@ -5198,6 +5306,7 @@
           <w:p>
             <w:pPr>
               <w:keepNext/>
+              <w:pageBreakBefore/>
               <w:spacing w:before="0" w:after="10" w:line="240" w:lineRule="auto"/>
               <w:jc w:val="left"/>
             </w:pPr>
@@ -5229,6 +5338,7 @@
           <w:p>
             <w:pPr>
               <w:keepNext/>
+              <w:pageBreakBefore/>
               <w:spacing w:before="0" w:after="10" w:line="240" w:lineRule="auto"/>
               <w:jc w:val="left"/>
             </w:pPr>
@@ -5250,7 +5360,7 @@
                 <w:sz w:val="14"/>
                 <w:szCs w:val="14"/>
               </w:rPr>
-              <w:t xml:space="preserve">Deniz, yönlendirici sorular sorulduğunda şiirde ahengi sağlayan özellikleri/unsurları belirler. (Ölçüt: %80 – 4/5)</w:t>
+              <w:t xml:space="preserve">Deniz, yönlendirici sorular sorulduğunda şiirin temasını belirler. (Ölçüt: %80 – 4/5)</w:t>
             </w:r>
           </w:p>
         </w:tc>
@@ -5269,6 +5379,7 @@
           <w:p>
             <w:pPr>
               <w:keepNext/>
+              <w:pageBreakBefore/>
               <w:spacing w:before="0" w:after="10" w:line="240" w:lineRule="auto"/>
               <w:jc w:val="left"/>
             </w:pPr>
@@ -5308,6 +5419,7 @@
           <w:p>
             <w:pPr>
               <w:keepNext/>
+              <w:pageBreakBefore/>
               <w:spacing w:before="0" w:after="10" w:line="240" w:lineRule="auto"/>
               <w:jc w:val="left"/>
             </w:pPr>
@@ -5451,7 +5563,7 @@
                 <w:sz w:val="15"/>
                 <w:szCs w:val="15"/>
               </w:rPr>
-              <w:t xml:space="preserve">5</w:t>
+              <w:t xml:space="preserve">4</w:t>
             </w:r>
           </w:p>
         </w:tc>
@@ -5553,7 +5665,7 @@
                 <w:sz w:val="14"/>
                 <w:szCs w:val="14"/>
               </w:rPr>
-              <w:t xml:space="preserve">Deniz, sadeleştirilmiş materyal verildiğinde şiirin nazım biçimini ve nazım türünü tespit eder. (Ölçüt: %80 – 4/5)</w:t>
+              <w:t xml:space="preserve">Deniz, sadeleştirilmiş materyal verildiğinde şiirde ahengi sağlayan özellikleri/unsurları belirler. (Ölçüt: %80 – 4/5)</w:t>
             </w:r>
           </w:p>
         </w:tc>
@@ -5744,7 +5856,7 @@
                 <w:sz w:val="15"/>
                 <w:szCs w:val="15"/>
               </w:rPr>
-              <w:t xml:space="preserve">5</w:t>
+              <w:t xml:space="preserve">4</w:t>
             </w:r>
           </w:p>
         </w:tc>
@@ -5846,7 +5958,7 @@
                 <w:sz w:val="14"/>
                 <w:szCs w:val="14"/>
               </w:rPr>
-              <w:t xml:space="preserve">Deniz, örnek bir uygulamayı inceledikten sonra “Şiir” ünitesi kapsamındaki sadeleştirilmiş bir metni okuyarak konusunu ve ana fikrini söyler. (Ölçüt: %80 – 4/5)</w:t>
+              <w:t xml:space="preserve">Deniz, örnek bir uygulamayı inceledikten sonra şiirin nazım biçimini ve nazım türünü tespit eder. (Ölçüt: %80 – 4/5)</w:t>
             </w:r>
           </w:p>
         </w:tc>
@@ -6037,7 +6149,7 @@
                 <w:sz w:val="15"/>
                 <w:szCs w:val="15"/>
               </w:rPr>
-              <w:t xml:space="preserve">5</w:t>
+              <w:t xml:space="preserve">4</w:t>
             </w:r>
           </w:p>
         </w:tc>
@@ -6139,7 +6251,7 @@
                 <w:sz w:val="14"/>
                 <w:szCs w:val="14"/>
               </w:rPr>
-              <w:t xml:space="preserve">Deniz, görsel ipuçlarıyla desteklendiğinde “Şiir” ünitesi kapsamındaki sadeleştirilmiş bir metni okuyarak konusunu ve ana fikrini söyler. (Ölçüt: %80 – 4/5)</w:t>
+              <w:t xml:space="preserve">Deniz, görsel ipuçlarıyla desteklendiğinde ““Şiir”” ünitesi kapsamındaki sadeleştirilmiş bir metni okuyarak konusunu ve ana fikrini söyler. (Ölçüt: %80 – 4/5)</w:t>
             </w:r>
           </w:p>
         </w:tc>
@@ -6344,7 +6456,7 @@
                 <w:sz w:val="15"/>
                 <w:szCs w:val="15"/>
               </w:rPr>
-              <w:t xml:space="preserve">5</w:t>
+              <w:t xml:space="preserve">4</w:t>
             </w:r>
           </w:p>
         </w:tc>
@@ -6461,7 +6573,7 @@
                 <w:sz w:val="14"/>
                 <w:szCs w:val="14"/>
               </w:rPr>
-              <w:t xml:space="preserve">Deniz, kısa bir sözel ipucu verildiğinde “Şiir” ünitesi kapsamındaki sadeleştirilmiş bir metni okuyarak konusunu ve ana fikrini söyler. (Ölçüt: %80 – 4/5)</w:t>
+              <w:t xml:space="preserve">Deniz, görsel ipuçlarıyla desteklendiğinde şiirin temasını belirler. (Ölçüt: %80 – 4/5)</w:t>
             </w:r>
           </w:p>
         </w:tc>
@@ -6580,7 +6692,6 @@
           <w:p>
             <w:pPr>
               <w:keepNext/>
-              <w:pageBreakBefore/>
               <w:spacing w:before="0" w:after="10" w:line="240" w:lineRule="auto"/>
               <w:jc w:val="center"/>
             </w:pPr>
@@ -6612,7 +6723,6 @@
           <w:p>
             <w:pPr>
               <w:keepNext/>
-              <w:pageBreakBefore/>
               <w:spacing w:before="0" w:after="10" w:line="240" w:lineRule="auto"/>
               <w:jc w:val="center"/>
             </w:pPr>
@@ -6644,7 +6754,6 @@
           <w:p>
             <w:pPr>
               <w:keepNext/>
-              <w:pageBreakBefore/>
               <w:spacing w:before="0" w:after="10" w:line="240" w:lineRule="auto"/>
               <w:jc w:val="center"/>
             </w:pPr>
@@ -6674,7 +6783,6 @@
           <w:p>
             <w:pPr>
               <w:keepNext/>
-              <w:pageBreakBefore/>
               <w:spacing w:before="0" w:after="10" w:line="240" w:lineRule="auto"/>
               <w:jc w:val="center"/>
             </w:pPr>
@@ -6687,7 +6795,7 @@
                 <w:sz w:val="15"/>
                 <w:szCs w:val="15"/>
               </w:rPr>
-              <w:t xml:space="preserve">5</w:t>
+              <w:t xml:space="preserve">4</w:t>
             </w:r>
           </w:p>
         </w:tc>
@@ -6706,7 +6814,6 @@
           <w:p>
             <w:pPr>
               <w:keepNext/>
-              <w:pageBreakBefore/>
               <w:spacing w:before="0" w:after="10" w:line="240" w:lineRule="auto"/>
               <w:jc w:val="left"/>
             </w:pPr>
@@ -6738,7 +6845,6 @@
           <w:p>
             <w:pPr>
               <w:keepNext/>
-              <w:pageBreakBefore/>
               <w:spacing w:before="0" w:after="10" w:line="240" w:lineRule="auto"/>
               <w:jc w:val="left"/>
             </w:pPr>
@@ -6770,7 +6876,6 @@
           <w:p>
             <w:pPr>
               <w:keepNext/>
-              <w:pageBreakBefore/>
               <w:spacing w:before="0" w:after="10" w:line="240" w:lineRule="auto"/>
               <w:jc w:val="left"/>
             </w:pPr>
@@ -6792,7 +6897,7 @@
                 <w:sz w:val="14"/>
                 <w:szCs w:val="14"/>
               </w:rPr>
-              <w:t xml:space="preserve">Deniz, bağımsız olarak “Şiir” ünitesi kapsamındaki sadeleştirilmiş bir metni okuyarak konusunu ve ana fikrini söyler. (Ölçüt: %80 – 4/5)</w:t>
+              <w:t xml:space="preserve">Deniz, farklı örneklerle çalışırken bağımsız olarak şiirin temasını belirler. (Ölçüt: %80 – 4/5)</w:t>
             </w:r>
           </w:p>
         </w:tc>
@@ -6811,7 +6916,6 @@
           <w:p>
             <w:pPr>
               <w:keepNext/>
-              <w:pageBreakBefore/>
               <w:spacing w:before="0" w:after="10" w:line="240" w:lineRule="auto"/>
               <w:jc w:val="left"/>
             </w:pPr>
@@ -6851,7 +6955,6 @@
           <w:p>
             <w:pPr>
               <w:keepNext/>
-              <w:pageBreakBefore/>
               <w:spacing w:before="0" w:after="10" w:line="240" w:lineRule="auto"/>
               <w:jc w:val="left"/>
             </w:pPr>
@@ -7009,7 +7112,7 @@
                 <w:sz w:val="15"/>
                 <w:szCs w:val="15"/>
               </w:rPr>
-              <w:t xml:space="preserve">5</w:t>
+              <w:t xml:space="preserve">4</w:t>
             </w:r>
           </w:p>
         </w:tc>
@@ -7302,7 +7405,7 @@
                 <w:sz w:val="15"/>
                 <w:szCs w:val="15"/>
               </w:rPr>
-              <w:t xml:space="preserve">5</w:t>
+              <w:t xml:space="preserve">4</w:t>
             </w:r>
           </w:p>
         </w:tc>
@@ -7402,7 +7505,7 @@
                 <w:sz w:val="14"/>
                 <w:szCs w:val="14"/>
               </w:rPr>
-              <w:t xml:space="preserve">Deniz, görsel ipuçlarıyla desteklendiğinde “Şiir” ünitesi kapsamında verilen yazma şablonunu kullanarak üç-dört cümlelik bir metin yazar. (Ölçüt: %80 – 4/5)</w:t>
+              <w:t xml:space="preserve">Deniz, görsel ipuçlarıyla desteklendiğinde “Şiir” ünitesi kapsamındaki sadeleştirilmiş bir metni okuyarak konusunu ve ana fikrini söyler. (Ölçüt: %80 – 4/5)</w:t>
             </w:r>
           </w:p>
         </w:tc>
@@ -7826,6 +7929,7 @@
           <w:p>
             <w:pPr>
               <w:keepNext/>
+              <w:pageBreakBefore/>
               <w:spacing w:before="0" w:after="10" w:line="240" w:lineRule="auto"/>
               <w:jc w:val="center"/>
             </w:pPr>
@@ -7857,6 +7961,7 @@
           <w:p>
             <w:pPr>
               <w:keepNext/>
+              <w:pageBreakBefore/>
               <w:spacing w:before="0" w:after="10" w:line="240" w:lineRule="auto"/>
               <w:jc w:val="center"/>
             </w:pPr>
@@ -7888,6 +7993,7 @@
           <w:p>
             <w:pPr>
               <w:keepNext/>
+              <w:pageBreakBefore/>
               <w:spacing w:before="0" w:after="10" w:line="240" w:lineRule="auto"/>
               <w:jc w:val="center"/>
             </w:pPr>
@@ -7917,6 +8023,7 @@
           <w:p>
             <w:pPr>
               <w:keepNext/>
+              <w:pageBreakBefore/>
               <w:spacing w:before="0" w:after="10" w:line="240" w:lineRule="auto"/>
               <w:jc w:val="center"/>
             </w:pPr>
@@ -7929,7 +8036,7 @@
                 <w:sz w:val="15"/>
                 <w:szCs w:val="15"/>
               </w:rPr>
-              <w:t xml:space="preserve">5</w:t>
+              <w:t xml:space="preserve">4</w:t>
             </w:r>
           </w:p>
         </w:tc>
@@ -7948,6 +8055,7 @@
           <w:p>
             <w:pPr>
               <w:keepNext/>
+              <w:pageBreakBefore/>
               <w:spacing w:before="0" w:after="10" w:line="240" w:lineRule="auto"/>
               <w:jc w:val="left"/>
             </w:pPr>
@@ -7979,6 +8087,7 @@
           <w:p>
             <w:pPr>
               <w:keepNext/>
+              <w:pageBreakBefore/>
               <w:spacing w:before="0" w:after="10" w:line="240" w:lineRule="auto"/>
               <w:jc w:val="left"/>
             </w:pPr>
@@ -8010,18 +8119,48 @@
           <w:p>
             <w:pPr>
               <w:keepNext/>
-              <w:spacing w:before="0" w:after="10" w:line="240" w:lineRule="auto"/>
-              <w:jc w:val="left"/>
-            </w:pPr>
-            <w:r>
-              <w:rPr>
-                <w:rFonts w:ascii="Calibri" w:hAnsi="Calibri" w:eastAsia="Calibri" w:cs="Calibri"/>
-                <w:b/>
-                <w:bCs/>
+              <w:pageBreakBefore/>
+              <w:spacing w:before="0" w:after="40" w:line="240" w:lineRule="auto"/>
+              <w:jc w:val="left"/>
+            </w:pPr>
+            <w:r>
+              <w:rPr>
+                <w:rFonts w:ascii="Calibri" w:hAnsi="Calibri" w:eastAsia="Calibri" w:cs="Calibri"/>
+                <w:b/>
+                <w:bCs/>
+                <w:color w:val="2B6CB0"/>
+                <w:sz w:val="14"/>
+                <w:szCs w:val="14"/>
+              </w:rPr>
+              <w:t xml:space="preserve">UDA 4: </w:t>
+            </w:r>
+            <w:r>
+              <w:rPr>
+                <w:rFonts w:ascii="Calibri" w:hAnsi="Calibri" w:eastAsia="Calibri" w:cs="Calibri"/>
+                <w:i/>
+                <w:iCs/>
                 <w:color w:val="1B365D"/>
                 <w:sz w:val="14"/>
                 <w:szCs w:val="14"/>
               </w:rPr>
+              <w:t xml:space="preserve">Deniz, “Roman” ünitesindeki sadeleştirilmiş metinleri okur; türün temel özelliklerini örnekler üzerinden açıklar ve bu türde kısa metinler oluşturur.</w:t>
+            </w:r>
+          </w:p>
+          <w:p>
+            <w:pPr>
+              <w:keepNext/>
+              <w:spacing w:before="0" w:after="10" w:line="240" w:lineRule="auto"/>
+              <w:jc w:val="left"/>
+            </w:pPr>
+            <w:r>
+              <w:rPr>
+                <w:rFonts w:ascii="Calibri" w:hAnsi="Calibri" w:eastAsia="Calibri" w:cs="Calibri"/>
+                <w:b/>
+                <w:bCs/>
+                <w:color w:val="1B365D"/>
+                <w:sz w:val="14"/>
+                <w:szCs w:val="14"/>
+              </w:rPr>
               <w:t xml:space="preserve">UDA 4 / KDA 4.1: </w:t>
             </w:r>
             <w:r>
@@ -8031,7 +8170,7 @@
                 <w:sz w:val="14"/>
                 <w:szCs w:val="14"/>
               </w:rPr>
-              <w:t xml:space="preserve">Deniz, sadeleştirilmiş materyal verildiğinde metindeki çatışmaları belirler. (Ölçüt: %80 – 4/5)</w:t>
+              <w:t xml:space="preserve">Deniz, sadeleştirilmiş materyal verildiğinde “Roman” ünitesi kapsamındaki metinlerde geçen anahtar kelimelerin anlamlarını örnek cümlelerle eşleştirir. (Ölçüt: %80 – 4/5)</w:t>
             </w:r>
           </w:p>
         </w:tc>
@@ -8050,6 +8189,7 @@
           <w:p>
             <w:pPr>
               <w:keepNext/>
+              <w:pageBreakBefore/>
               <w:spacing w:before="0" w:after="10" w:line="240" w:lineRule="auto"/>
               <w:jc w:val="left"/>
             </w:pPr>
@@ -8089,6 +8229,7 @@
           <w:p>
             <w:pPr>
               <w:keepNext/>
+              <w:pageBreakBefore/>
               <w:spacing w:before="0" w:after="10" w:line="240" w:lineRule="auto"/>
               <w:jc w:val="left"/>
             </w:pPr>
@@ -8222,7 +8363,7 @@
                 <w:sz w:val="15"/>
                 <w:szCs w:val="15"/>
               </w:rPr>
-              <w:t xml:space="preserve">5</w:t>
+              <w:t xml:space="preserve">4</w:t>
             </w:r>
           </w:p>
         </w:tc>
@@ -8324,7 +8465,7 @@
                 <w:sz w:val="14"/>
                 <w:szCs w:val="14"/>
               </w:rPr>
-              <w:t xml:space="preserve">Deniz, örnek bir uygulamayı inceledikten sonra metnin olay örgüsünü belirler. (Ölçüt: %80 – 4/5)</w:t>
+              <w:t xml:space="preserve">Deniz, örnek bir uygulamayı inceledikten sonra metindeki çatışmaları belirler. (Ölçüt: %80 – 4/5)</w:t>
             </w:r>
           </w:p>
         </w:tc>
@@ -8529,7 +8670,7 @@
                 <w:sz w:val="15"/>
                 <w:szCs w:val="15"/>
               </w:rPr>
-              <w:t xml:space="preserve">5</w:t>
+              <w:t xml:space="preserve">4</w:t>
             </w:r>
           </w:p>
         </w:tc>
@@ -8646,7 +8787,7 @@
                 <w:sz w:val="14"/>
                 <w:szCs w:val="14"/>
               </w:rPr>
-              <w:t xml:space="preserve">Deniz, kısa bir sözel ipucu verildiğinde metinde geçen kelime ve kelime gruplarının anlamlarını tespit eder. (Ölçüt: %80 – 4/5)</w:t>
+              <w:t xml:space="preserve">Deniz, görsel ipuçlarıyla desteklendiğinde metnin olay örgüsünü belirler. (Ölçüt: %80 – 4/5)</w:t>
             </w:r>
           </w:p>
         </w:tc>
@@ -8755,7 +8896,6 @@
           <w:p>
             <w:pPr>
               <w:keepNext/>
-              <w:pageBreakBefore/>
               <w:spacing w:before="0" w:after="10" w:line="240" w:lineRule="auto"/>
               <w:jc w:val="center"/>
             </w:pPr>
@@ -8787,7 +8927,6 @@
           <w:p>
             <w:pPr>
               <w:keepNext/>
-              <w:pageBreakBefore/>
               <w:spacing w:before="0" w:after="10" w:line="240" w:lineRule="auto"/>
               <w:jc w:val="center"/>
             </w:pPr>
@@ -8819,7 +8958,6 @@
           <w:p>
             <w:pPr>
               <w:keepNext/>
-              <w:pageBreakBefore/>
               <w:spacing w:before="0" w:after="10" w:line="240" w:lineRule="auto"/>
               <w:jc w:val="center"/>
             </w:pPr>
@@ -8849,7 +8987,6 @@
           <w:p>
             <w:pPr>
               <w:keepNext/>
-              <w:pageBreakBefore/>
               <w:spacing w:before="0" w:after="10" w:line="240" w:lineRule="auto"/>
               <w:jc w:val="center"/>
             </w:pPr>
@@ -8862,7 +8999,7 @@
                 <w:sz w:val="15"/>
                 <w:szCs w:val="15"/>
               </w:rPr>
-              <w:t xml:space="preserve">5</w:t>
+              <w:t xml:space="preserve">4</w:t>
             </w:r>
           </w:p>
         </w:tc>
@@ -8881,7 +9018,6 @@
           <w:p>
             <w:pPr>
               <w:keepNext/>
-              <w:pageBreakBefore/>
               <w:spacing w:before="0" w:after="10" w:line="240" w:lineRule="auto"/>
               <w:jc w:val="left"/>
             </w:pPr>
@@ -8913,7 +9049,6 @@
           <w:p>
             <w:pPr>
               <w:keepNext/>
-              <w:pageBreakBefore/>
               <w:spacing w:before="0" w:after="10" w:line="240" w:lineRule="auto"/>
               <w:jc w:val="left"/>
             </w:pPr>
@@ -8945,7 +9080,6 @@
           <w:p>
             <w:pPr>
               <w:keepNext/>
-              <w:pageBreakBefore/>
               <w:spacing w:before="0" w:after="10" w:line="240" w:lineRule="auto"/>
               <w:jc w:val="left"/>
             </w:pPr>
@@ -8967,7 +9101,7 @@
                 <w:sz w:val="14"/>
                 <w:szCs w:val="14"/>
               </w:rPr>
-              <w:t xml:space="preserve">Deniz, bağımsız olarak metinde geçen kelime ve kelime gruplarının anlamlarını tespit eder. (Ölçüt: %80 – 4/5)</w:t>
+              <w:t xml:space="preserve">Deniz, yönlendirici sorular sorulduğunda ““Roman”” ünitesi kapsamındaki sadeleştirilmiş bir metni okuyarak konusunu ve ana fikrini söyler. (Ölçüt: %80 – 4/5)</w:t>
             </w:r>
           </w:p>
         </w:tc>
@@ -8986,7 +9120,6 @@
           <w:p>
             <w:pPr>
               <w:keepNext/>
-              <w:pageBreakBefore/>
               <w:spacing w:before="0" w:after="10" w:line="240" w:lineRule="auto"/>
               <w:jc w:val="left"/>
             </w:pPr>
@@ -9026,7 +9159,6 @@
           <w:p>
             <w:pPr>
               <w:keepNext/>
-              <w:pageBreakBefore/>
               <w:spacing w:before="0" w:after="10" w:line="240" w:lineRule="auto"/>
               <w:jc w:val="left"/>
             </w:pPr>
@@ -9446,7 +9578,7 @@
                 <w:sz w:val="15"/>
                 <w:szCs w:val="15"/>
               </w:rPr>
-              <w:t xml:space="preserve">5</w:t>
+              <w:t xml:space="preserve">4</w:t>
             </w:r>
           </w:p>
         </w:tc>
@@ -9548,7 +9680,7 @@
                 <w:sz w:val="14"/>
                 <w:szCs w:val="14"/>
               </w:rPr>
-              <w:t xml:space="preserve">Deniz, farklı örneklerle çalışırken bağımsız olarak metinde geçen kelime ve kelime gruplarının anlamlarını tespit eder. (Ölçüt: %80 – 4/5)</w:t>
+              <w:t xml:space="preserve">Deniz, görsel ipuçlarıyla desteklendiğinde metindeki çatışmaları belirler. (Ölçüt: %80 – 4/5)</w:t>
             </w:r>
           </w:p>
         </w:tc>
@@ -9759,7 +9891,7 @@
                 <w:sz w:val="15"/>
                 <w:szCs w:val="15"/>
               </w:rPr>
-              <w:t xml:space="preserve">5</w:t>
+              <w:t xml:space="preserve">4</w:t>
             </w:r>
           </w:p>
         </w:tc>
@@ -9861,7 +9993,7 @@
                 <w:sz w:val="14"/>
                 <w:szCs w:val="14"/>
               </w:rPr>
-              <w:t xml:space="preserve">Deniz, farklı örneklerle çalışırken bağımsız olarak metinde geçen kelime ve kelime gruplarının anlamlarını tespit eder. (Ölçüt: %80 – 4/5)</w:t>
+              <w:t xml:space="preserve">Deniz, günlük yaşamla ilişkili bir örnekte metnin olay örgüsünü belirler. (Ölçüt: %80 – 4/5)</w:t>
             </w:r>
           </w:p>
         </w:tc>
@@ -10066,7 +10198,7 @@
                 <w:sz w:val="15"/>
                 <w:szCs w:val="15"/>
               </w:rPr>
-              <w:t xml:space="preserve">5</w:t>
+              <w:t xml:space="preserve">4</w:t>
             </w:r>
           </w:p>
         </w:tc>
@@ -10183,7 +10315,7 @@
                 <w:sz w:val="14"/>
                 <w:szCs w:val="14"/>
               </w:rPr>
-              <w:t xml:space="preserve">Deniz, farklı örneklerle çalışırken bağımsız olarak metinde geçen kelime ve kelime gruplarının anlamlarını tespit eder. (Ölçüt: %80 – 4/5)</w:t>
+              <w:t xml:space="preserve">Deniz, farklı örneklerle çalışırken bağımsız olarak metindeki çatışmaları belirler. (Ölçüt: %80 – 4/5)</w:t>
             </w:r>
           </w:p>
         </w:tc>
@@ -10423,7 +10555,7 @@
                 <w:sz w:val="15"/>
                 <w:szCs w:val="15"/>
               </w:rPr>
-              <w:t xml:space="preserve">5</w:t>
+              <w:t xml:space="preserve">4</w:t>
             </w:r>
           </w:p>
         </w:tc>
@@ -10526,7 +10658,7 @@
                 <w:sz w:val="14"/>
                 <w:szCs w:val="14"/>
               </w:rPr>
-              <w:t xml:space="preserve">Deniz, yönlendirici sorular sorulduğunda “Roman” ünitesi kapsamında verilen yazma şablonunu kullanarak üç-dört cümlelik bir metin yazar. (Ölçüt: %80 – 4/5)</w:t>
+              <w:t xml:space="preserve">Deniz, yönlendirici sorular sorulduğunda “Roman” ünitesi kapsamındaki sadeleştirilmiş bir metni okuyarak konusunu ve ana fikrini söyler. (Ölçüt: %80 – 4/5)</w:t>
             </w:r>
           </w:p>
         </w:tc>
@@ -10719,7 +10851,7 @@
                 <w:sz w:val="15"/>
                 <w:szCs w:val="15"/>
               </w:rPr>
-              <w:t xml:space="preserve">5</w:t>
+              <w:t xml:space="preserve">4</w:t>
             </w:r>
           </w:p>
         </w:tc>
@@ -10819,7 +10951,7 @@
                 <w:sz w:val="14"/>
                 <w:szCs w:val="14"/>
               </w:rPr>
-              <w:t xml:space="preserve">Deniz, görsel ipuçlarıyla desteklendiğinde “Roman” ünitesi kapsamında verilen yazma şablonunu kullanarak üç-dört cümlelik bir metin yazar. (Ölçüt: %80 – 4/5)</w:t>
+              <w:t xml:space="preserve">Deniz, sadeleştirilmiş materyal verildiğinde “Roman” ünitesi kapsamında öğrendiklerini kısa bir sözlü ya da yazılı anlatımla paylaşır. (Ölçüt: %80 – 4/5)</w:t>
             </w:r>
           </w:p>
         </w:tc>
@@ -11010,7 +11142,7 @@
                 <w:sz w:val="15"/>
                 <w:szCs w:val="15"/>
               </w:rPr>
-              <w:t xml:space="preserve">5</w:t>
+              <w:t xml:space="preserve">4</w:t>
             </w:r>
           </w:p>
         </w:tc>
@@ -11088,6 +11220,35 @@
             </w:tcMar>
             <w:vAlign w:val="center"/>
           </w:tcPr>
+          <w:p>
+            <w:pPr>
+              <w:keepNext/>
+              <w:spacing w:before="0" w:after="40" w:line="240" w:lineRule="auto"/>
+              <w:jc w:val="left"/>
+            </w:pPr>
+            <w:r>
+              <w:rPr>
+                <w:rFonts w:ascii="Calibri" w:hAnsi="Calibri" w:eastAsia="Calibri" w:cs="Calibri"/>
+                <w:b/>
+                <w:bCs/>
+                <w:color w:val="2B6CB0"/>
+                <w:sz w:val="14"/>
+                <w:szCs w:val="14"/>
+              </w:rPr>
+              <w:t xml:space="preserve">UDA 5: </w:t>
+            </w:r>
+            <w:r>
+              <w:rPr>
+                <w:rFonts w:ascii="Calibri" w:hAnsi="Calibri" w:eastAsia="Calibri" w:cs="Calibri"/>
+                <w:i/>
+                <w:iCs/>
+                <w:color w:val="1B365D"/>
+                <w:sz w:val="14"/>
+                <w:szCs w:val="14"/>
+              </w:rPr>
+              <w:t xml:space="preserve">Deniz, “Tiyatro” ünitesindeki sadeleştirilmiş metinleri okur; türün temel özelliklerini örnekler üzerinden açıklar ve bu türde kısa metinler oluşturur.</w:t>
+            </w:r>
+          </w:p>
           <w:p>
             <w:pPr>
               <w:keepNext/>
@@ -11337,7 +11498,7 @@
                 <w:sz w:val="15"/>
                 <w:szCs w:val="15"/>
               </w:rPr>
-              <w:t xml:space="preserve">5</w:t>
+              <w:t xml:space="preserve">4</w:t>
             </w:r>
           </w:p>
         </w:tc>
@@ -11676,7 +11837,7 @@
                 <w:sz w:val="15"/>
                 <w:szCs w:val="15"/>
               </w:rPr>
-              <w:t xml:space="preserve">5</w:t>
+              <w:t xml:space="preserve">4</w:t>
             </w:r>
           </w:p>
         </w:tc>
@@ -11776,7 +11937,7 @@
                 <w:sz w:val="14"/>
                 <w:szCs w:val="14"/>
               </w:rPr>
-              <w:t xml:space="preserve">Deniz, görsel ipuçlarıyla desteklendiğinde metinlerden hareketle dil bilgisi çalışmaları yapar. (Ölçüt: %80 – 4/5)</w:t>
+              <w:t xml:space="preserve">Deniz, sadeleştirilmiş materyal verildiğinde metinden seçilen cümlelerde temel yazım ve noktalama kurallarını doğru uygular. (Ölçüt: %80 – 4/5)</w:t>
             </w:r>
           </w:p>
         </w:tc>
@@ -11967,7 +12128,7 @@
                 <w:sz w:val="15"/>
                 <w:szCs w:val="15"/>
               </w:rPr>
-              <w:t xml:space="preserve">5</w:t>
+              <w:t xml:space="preserve">4</w:t>
             </w:r>
           </w:p>
         </w:tc>
@@ -12067,7 +12228,7 @@
                 <w:sz w:val="14"/>
                 <w:szCs w:val="14"/>
               </w:rPr>
-              <w:t xml:space="preserve">Deniz, örnek bir uygulamayı inceledikten sonra “Tiyatro” ünitesi kapsamında verilen yazma şablonunu kullanarak üç-dört cümlelik bir metin yazar. (Ölçüt: %80 – 4/5)</w:t>
+              <w:t xml:space="preserve">Deniz, örnek bir uygulamayı inceledikten sonra “Tiyatro” ünitesi kapsamındaki sadeleştirilmiş bir metni okuyarak konusunu ve ana fikrini söyler. (Ölçüt: %80 – 4/5)</w:t>
             </w:r>
           </w:p>
         </w:tc>
@@ -12258,7 +12419,7 @@
                 <w:sz w:val="15"/>
                 <w:szCs w:val="15"/>
               </w:rPr>
-              <w:t xml:space="preserve">5</w:t>
+              <w:t xml:space="preserve">4</w:t>
             </w:r>
           </w:p>
         </w:tc>
@@ -12336,6 +12497,35 @@
             </w:tcMar>
             <w:vAlign w:val="center"/>
           </w:tcPr>
+          <w:p>
+            <w:pPr>
+              <w:keepNext/>
+              <w:spacing w:before="0" w:after="40" w:line="240" w:lineRule="auto"/>
+              <w:jc w:val="left"/>
+            </w:pPr>
+            <w:r>
+              <w:rPr>
+                <w:rFonts w:ascii="Calibri" w:hAnsi="Calibri" w:eastAsia="Calibri" w:cs="Calibri"/>
+                <w:b/>
+                <w:bCs/>
+                <w:color w:val="2B6CB0"/>
+                <w:sz w:val="14"/>
+                <w:szCs w:val="14"/>
+              </w:rPr>
+              <w:t xml:space="preserve">UDA 6: </w:t>
+            </w:r>
+            <w:r>
+              <w:rPr>
+                <w:rFonts w:ascii="Calibri" w:hAnsi="Calibri" w:eastAsia="Calibri" w:cs="Calibri"/>
+                <w:i/>
+                <w:iCs/>
+                <w:color w:val="1B365D"/>
+                <w:sz w:val="14"/>
+                <w:szCs w:val="14"/>
+              </w:rPr>
+              <w:t xml:space="preserve">Deniz, “Deneme” ünitesindeki sadeleştirilmiş metinleri okur; türün temel özelliklerini örnekler üzerinden açıklar ve bu türde kısa metinler oluşturur.</w:t>
+            </w:r>
+          </w:p>
           <w:p>
             <w:pPr>
               <w:keepNext/>
@@ -12585,7 +12775,7 @@
                 <w:sz w:val="15"/>
                 <w:szCs w:val="15"/>
               </w:rPr>
-              <w:t xml:space="preserve">5</w:t>
+              <w:t xml:space="preserve">4</w:t>
             </w:r>
           </w:p>
         </w:tc>
@@ -12700,7 +12890,7 @@
                 <w:sz w:val="14"/>
                 <w:szCs w:val="14"/>
               </w:rPr>
-              <w:t xml:space="preserve">Deniz, sadeleştirilmiş materyal verildiğinde “Deneme” ünitesi kapsamında verilen yazma şablonunu kullanarak üç-dört cümlelik bir metin yazar. (Ölçüt: %80 – 4/5)</w:t>
+              <w:t xml:space="preserve">Deniz, sadeleştirilmiş materyal verildiğinde ““Deneme”” ünitesi kapsamında verilen yazma şablonunu kullanarak üç-dört cümlelik bir metin yazar. (Ölçüt: %80 – 4/5)</w:t>
             </w:r>
           </w:p>
         </w:tc>
@@ -12950,7 +13140,7 @@
                 <w:sz w:val="15"/>
                 <w:szCs w:val="15"/>
               </w:rPr>
-              <w:t xml:space="preserve">5</w:t>
+              <w:t xml:space="preserve">4</w:t>
             </w:r>
           </w:p>
         </w:tc>
@@ -13034,6 +13224,35 @@
             <w:pPr>
               <w:keepNext/>
               <w:pageBreakBefore/>
+              <w:spacing w:before="0" w:after="40" w:line="240" w:lineRule="auto"/>
+              <w:jc w:val="left"/>
+            </w:pPr>
+            <w:r>
+              <w:rPr>
+                <w:rFonts w:ascii="Calibri" w:hAnsi="Calibri" w:eastAsia="Calibri" w:cs="Calibri"/>
+                <w:b/>
+                <w:bCs/>
+                <w:color w:val="2B6CB0"/>
+                <w:sz w:val="14"/>
+                <w:szCs w:val="14"/>
+              </w:rPr>
+              <w:t xml:space="preserve">UDA 7: </w:t>
+            </w:r>
+            <w:r>
+              <w:rPr>
+                <w:rFonts w:ascii="Calibri" w:hAnsi="Calibri" w:eastAsia="Calibri" w:cs="Calibri"/>
+                <w:i/>
+                <w:iCs/>
+                <w:color w:val="1B365D"/>
+                <w:sz w:val="14"/>
+                <w:szCs w:val="14"/>
+              </w:rPr>
+              <w:t xml:space="preserve">Deniz, “Söylev (Nutuk)” ünitesindeki sadeleştirilmiş metinleri okur; türün temel özelliklerini örnekler üzerinden açıklar ve bu türde kısa metinler oluşturur.</w:t>
+            </w:r>
+          </w:p>
+          <w:p>
+            <w:pPr>
+              <w:keepNext/>
               <w:spacing w:before="0" w:after="10" w:line="240" w:lineRule="auto"/>
               <w:jc w:val="left"/>
             </w:pPr>
@@ -13248,7 +13467,7 @@
                 <w:sz w:val="15"/>
                 <w:szCs w:val="15"/>
               </w:rPr>
-              <w:t xml:space="preserve">5</w:t>
+              <w:t xml:space="preserve">4</w:t>
             </w:r>
           </w:p>
         </w:tc>
@@ -13539,7 +13758,7 @@
                 <w:sz w:val="15"/>
                 <w:szCs w:val="15"/>
               </w:rPr>
-              <w:t xml:space="preserve">5</w:t>
+              <w:t xml:space="preserve">4</w:t>
             </w:r>
           </w:p>
         </w:tc>
@@ -13639,7 +13858,7 @@
                 <w:sz w:val="14"/>
                 <w:szCs w:val="14"/>
               </w:rPr>
-              <w:t xml:space="preserve">Deniz, sadeleştirilmiş materyal verildiğinde “Söylev (Nutuk)” ünitesi kapsamında verilen yazma şablonunu kullanarak üç-dört cümlelik bir metin yazar. (Ölçüt: %80 – 4/5)</w:t>
+              <w:t xml:space="preserve">Deniz, sadeleştirilmiş materyal verildiğinde ““Söylev (Nutuk)”” ünitesi kapsamında verilen yazma şablonunu kullanarak üç-dört cümlelik bir metin yazar. (Ölçüt: %80 – 4/5)</w:t>
             </w:r>
           </w:p>
         </w:tc>

</xml_diff>

<commit_message>
Kazanım sınırını kaldır, karma tanı koşullarını ve boş ünite adını düzelt
- Tüm planlarda haftalık 4 kazanım sınırı kaldırıldı (Arapça, TDE 12,
  Mesleki Arapça vb. 1543 kazanım artık veriden düşmüyor)
- Karma tanıda (ör. özel yetenek + DEHB) KDA koşulları tüm tanılardan
  harmanlanır; destek odaklı planda zenginleştirme koşulu çıkmaz
- "1. Ünite" gibi yalnız numaradan oluşan ünite adı boş tırnak üretmez
- Yazdır: uzun etiketli satırın devamında kısaltılmış etiket ve (devam) yazılır
- Regresyon testleri eklendi; paket ve örnek çıktılar yenilendi

Co-Authored-By: Claude Opus 5.5 <noreply@anthropic.com>
Claude-Session: https://claude.ai/code/session_01APr7gL8YXcH56hb2LLW1Uh
</commit_message>
<xml_diff>
--- a/ornek_cikti/Ornek_12_Sinif_Turk_Dili_ve_Edebiyati_BEP_Plani.docx
+++ b/ornek_cikti/Ornek_12_Sinif_Turk_Dili_ve_Edebiyati_BEP_Plani.docx
@@ -2446,7 +2446,7 @@
               </w:rPr>
               <w:t xml:space="preserve">A.2.1. Metinde geçen kelime ve kelime gruplarının anlamlarını tespit eder.</w:t>
               <w:br/>
-              <w:t xml:space="preserve">(+3 öğrenme çıktısı/kazanım daha)</w:t>
+              <w:t xml:space="preserve">(+14 öğrenme çıktısı/kazanım daha)</w:t>
             </w:r>
           </w:p>
         </w:tc>
@@ -2793,7 +2793,7 @@
               </w:rPr>
               <w:t xml:space="preserve">A.2.1. Metinde geçen kelime ve kelime gruplarının anlamlarını tespit eder.</w:t>
               <w:br/>
-              <w:t xml:space="preserve">(+3 öğrenme çıktısı/kazanım daha)</w:t>
+              <w:t xml:space="preserve">(+14 öğrenme çıktısı/kazanım daha)</w:t>
             </w:r>
           </w:p>
         </w:tc>
@@ -3086,7 +3086,7 @@
               </w:rPr>
               <w:t xml:space="preserve">A.2.1. Metinde geçen kelime ve kelime gruplarının anlamlarını tespit eder.</w:t>
               <w:br/>
-              <w:t xml:space="preserve">(+3 öğrenme çıktısı/kazanım daha)</w:t>
+              <w:t xml:space="preserve">(+14 öğrenme çıktısı/kazanım daha)</w:t>
             </w:r>
           </w:p>
         </w:tc>
@@ -3737,7 +3737,7 @@
                 <w:sz w:val="14"/>
                 <w:szCs w:val="14"/>
               </w:rPr>
-              <w:t xml:space="preserve">Deniz, görsel ipuçlarıyla desteklendiğinde ““Hikâye”” ünitesi kapsamında verilen yazma şablonunu kullanarak üç-dört cümlelik bir metin yazar. (Ölçüt: %80 – 4/5)</w:t>
+              <w:t xml:space="preserve">Deniz, görsel ipuçlarıyla desteklendiğinde “Hikâye” ünitesi kapsamında verilen yazma şablonunu kullanarak üç-dört cümlelik bir metin yazar. (Ölçüt: %80 – 4/5)</w:t>
             </w:r>
           </w:p>
         </w:tc>
@@ -4076,7 +4076,7 @@
                 <w:sz w:val="14"/>
                 <w:szCs w:val="14"/>
               </w:rPr>
-              <w:t xml:space="preserve">Deniz, görsel ipuçlarıyla desteklendiğinde “Hikâye” ünitesi kapsamındaki sadeleştirilmiş bir metni okuyarak konusunu ve ana fikrini söyler. (Ölçüt: %80 – 4/5)</w:t>
+              <w:t xml:space="preserve">Deniz, yönlendirici sorular sorulduğunda “Hikâye” ünitesi kapsamında öğrendiklerini kısa bir sözlü ya da yazılı anlatımla paylaşır. (Ölçüt: %80 – 4/5)</w:t>
             </w:r>
           </w:p>
         </w:tc>
@@ -4393,7 +4393,7 @@
                 <w:sz w:val="14"/>
                 <w:szCs w:val="14"/>
               </w:rPr>
-              <w:t xml:space="preserve">Deniz, sadeleştirilmiş materyal verildiğinde “Hikâye” ünitesi kapsamında öğrendiklerini kısa bir sözlü ya da yazılı anlatımla paylaşır. (Ölçüt: %80 – 4/5)</w:t>
+              <w:t xml:space="preserve">Deniz, sadeleştirilmiş materyal verildiğinde önceki haftalarda çalışılan amaca yönelik pekiştirme etkinliklerini tamamlar. (Ölçüt: %80 – 4/5)</w:t>
             </w:r>
           </w:p>
         </w:tc>
@@ -4956,7 +4956,7 @@
               </w:rPr>
               <w:t xml:space="preserve">A.1.1. Metinde geçen kelime ve kelime gruplarının anlamlarını tespit eder.</w:t>
               <w:br/>
-              <w:t xml:space="preserve">(+3 öğrenme çıktısı/kazanım daha)</w:t>
+              <w:t xml:space="preserve">(+11 öğrenme çıktısı/kazanım daha)</w:t>
             </w:r>
           </w:p>
         </w:tc>
@@ -5319,7 +5319,7 @@
               </w:rPr>
               <w:t xml:space="preserve">A.1.1. Metinde geçen kelime ve kelime gruplarının anlamlarını tespit eder.</w:t>
               <w:br/>
-              <w:t xml:space="preserve">(+3 öğrenme çıktısı/kazanım daha)</w:t>
+              <w:t xml:space="preserve">(+11 öğrenme çıktısı/kazanım daha)</w:t>
             </w:r>
           </w:p>
         </w:tc>
@@ -5625,7 +5625,7 @@
               </w:rPr>
               <w:t xml:space="preserve">A.1.1. Metinde geçen kelime ve kelime gruplarının anlamlarını tespit eder.</w:t>
               <w:br/>
-              <w:t xml:space="preserve">(+3 öğrenme çıktısı/kazanım daha)</w:t>
+              <w:t xml:space="preserve">(+11 öğrenme çıktısı/kazanım daha)</w:t>
             </w:r>
           </w:p>
         </w:tc>
@@ -5918,7 +5918,7 @@
               </w:rPr>
               <w:t xml:space="preserve">A.1.1. Metinde geçen kelime ve kelime gruplarının anlamlarını tespit eder.</w:t>
               <w:br/>
-              <w:t xml:space="preserve">(+3 öğrenme çıktısı/kazanım daha)</w:t>
+              <w:t xml:space="preserve">(+11 öğrenme çıktısı/kazanım daha)</w:t>
             </w:r>
           </w:p>
         </w:tc>
@@ -6211,7 +6211,7 @@
               </w:rPr>
               <w:t xml:space="preserve">A.1.1. Metinde geçen kelime ve kelime gruplarının anlamlarını tespit eder.</w:t>
               <w:br/>
-              <w:t xml:space="preserve">(+3 öğrenme çıktısı/kazanım daha)</w:t>
+              <w:t xml:space="preserve">(+11 öğrenme çıktısı/kazanım daha)</w:t>
             </w:r>
           </w:p>
         </w:tc>
@@ -6251,7 +6251,7 @@
                 <w:sz w:val="14"/>
                 <w:szCs w:val="14"/>
               </w:rPr>
-              <w:t xml:space="preserve">Deniz, görsel ipuçlarıyla desteklendiğinde ““Şiir”” ünitesi kapsamındaki sadeleştirilmiş bir metni okuyarak konusunu ve ana fikrini söyler. (Ölçüt: %80 – 4/5)</w:t>
+              <w:t xml:space="preserve">Deniz, görsel ipuçlarıyla desteklendiğinde “Şiir” ünitesi kapsamındaki sadeleştirilmiş bir metni okuyarak konusunu ve ana fikrini söyler. (Ölçüt: %80 – 4/5)</w:t>
             </w:r>
           </w:p>
         </w:tc>
@@ -6528,7 +6528,7 @@
               </w:rPr>
               <w:t xml:space="preserve">A.1.1. Metinde geçen kelime ve kelime gruplarının anlamlarını tespit eder.</w:t>
               <w:br/>
-              <w:t xml:space="preserve">(+3 öğrenme çıktısı/kazanım daha)</w:t>
+              <w:t xml:space="preserve">(+11 öğrenme çıktısı/kazanım daha)</w:t>
             </w:r>
           </w:p>
         </w:tc>
@@ -6857,7 +6857,7 @@
               </w:rPr>
               <w:t xml:space="preserve">A.1.1. Metinde geçen kelime ve kelime gruplarının anlamlarını tespit eder.</w:t>
               <w:br/>
-              <w:t xml:space="preserve">(+3 öğrenme çıktısı/kazanım daha)</w:t>
+              <w:t xml:space="preserve">(+10 öğrenme çıktısı/kazanım daha)</w:t>
             </w:r>
           </w:p>
         </w:tc>
@@ -7505,7 +7505,7 @@
                 <w:sz w:val="14"/>
                 <w:szCs w:val="14"/>
               </w:rPr>
-              <w:t xml:space="preserve">Deniz, görsel ipuçlarıyla desteklendiğinde “Şiir” ünitesi kapsamındaki sadeleştirilmiş bir metni okuyarak konusunu ve ana fikrini söyler. (Ölçüt: %80 – 4/5)</w:t>
+              <w:t xml:space="preserve">Deniz, görsel ipuçlarıyla desteklendiğinde önceki haftalarda öğrendiklerini kısa bir uygulama etkinliğinde kullanır. (Ölçüt: %80 – 4/5)</w:t>
             </w:r>
           </w:p>
         </w:tc>
@@ -8100,7 +8100,7 @@
               </w:rPr>
               <w:t xml:space="preserve">A.2.1. Metinde geçen kelime ve kelime gruplarının anlamlarını tespit eder.</w:t>
               <w:br/>
-              <w:t xml:space="preserve">(+3 öğrenme çıktısı/kazanım daha)</w:t>
+              <w:t xml:space="preserve">(+14 öğrenme çıktısı/kazanım daha)</w:t>
             </w:r>
           </w:p>
         </w:tc>
@@ -8425,7 +8425,7 @@
               </w:rPr>
               <w:t xml:space="preserve">A.2.1. Metinde geçen kelime ve kelime gruplarının anlamlarını tespit eder.</w:t>
               <w:br/>
-              <w:t xml:space="preserve">(+3 öğrenme çıktısı/kazanım daha)</w:t>
+              <w:t xml:space="preserve">(+14 öğrenme çıktısı/kazanım daha)</w:t>
             </w:r>
           </w:p>
         </w:tc>
@@ -8742,7 +8742,7 @@
               </w:rPr>
               <w:t xml:space="preserve">A.2.1. Metinde geçen kelime ve kelime gruplarının anlamlarını tespit eder.</w:t>
               <w:br/>
-              <w:t xml:space="preserve">(+3 öğrenme çıktısı/kazanım daha)</w:t>
+              <w:t xml:space="preserve">(+14 öğrenme çıktısı/kazanım daha)</w:t>
             </w:r>
           </w:p>
         </w:tc>
@@ -9061,7 +9061,7 @@
               </w:rPr>
               <w:t xml:space="preserve">A.2.1. Metinde geçen kelime ve kelime gruplarının anlamlarını tespit eder.</w:t>
               <w:br/>
-              <w:t xml:space="preserve">(+3 öğrenme çıktısı/kazanım daha)</w:t>
+              <w:t xml:space="preserve">(+14 öğrenme çıktısı/kazanım daha)</w:t>
             </w:r>
           </w:p>
         </w:tc>
@@ -9101,7 +9101,7 @@
                 <w:sz w:val="14"/>
                 <w:szCs w:val="14"/>
               </w:rPr>
-              <w:t xml:space="preserve">Deniz, yönlendirici sorular sorulduğunda ““Roman”” ünitesi kapsamındaki sadeleştirilmiş bir metni okuyarak konusunu ve ana fikrini söyler. (Ölçüt: %80 – 4/5)</w:t>
+              <w:t xml:space="preserve">Deniz, yönlendirici sorular sorulduğunda “Roman” ünitesi kapsamındaki sadeleştirilmiş bir metni okuyarak konusunu ve ana fikrini söyler. (Ölçüt: %80 – 4/5)</w:t>
             </w:r>
           </w:p>
         </w:tc>
@@ -9640,7 +9640,7 @@
               </w:rPr>
               <w:t xml:space="preserve">A.2.1. Metinde geçen kelime ve kelime gruplarının anlamlarını tespit eder.</w:t>
               <w:br/>
-              <w:t xml:space="preserve">(+3 öğrenme çıktısı/kazanım daha)</w:t>
+              <w:t xml:space="preserve">(+14 öğrenme çıktısı/kazanım daha)</w:t>
             </w:r>
           </w:p>
         </w:tc>
@@ -9953,7 +9953,7 @@
               </w:rPr>
               <w:t xml:space="preserve">A.2.1. Metinde geçen kelime ve kelime gruplarının anlamlarını tespit eder.</w:t>
               <w:br/>
-              <w:t xml:space="preserve">(+3 öğrenme çıktısı/kazanım daha)</w:t>
+              <w:t xml:space="preserve">(+13 öğrenme çıktısı/kazanım daha)</w:t>
             </w:r>
           </w:p>
         </w:tc>
@@ -9993,7 +9993,7 @@
                 <w:sz w:val="14"/>
                 <w:szCs w:val="14"/>
               </w:rPr>
-              <w:t xml:space="preserve">Deniz, günlük yaşamla ilişkili bir örnekte metnin olay örgüsünü belirler. (Ölçüt: %80 – 4/5)</w:t>
+              <w:t xml:space="preserve">Deniz, akranıyla eşli çalışırken metnin olay örgüsünü belirler. (Ölçüt: %80 – 4/5)</w:t>
             </w:r>
           </w:p>
         </w:tc>
@@ -10270,7 +10270,7 @@
               </w:rPr>
               <w:t xml:space="preserve">A.2.1. Metinde geçen kelime ve kelime gruplarının anlamlarını tespit eder.</w:t>
               <w:br/>
-              <w:t xml:space="preserve">(+3 öğrenme çıktısı/kazanım daha)</w:t>
+              <w:t xml:space="preserve">(+15 öğrenme çıktısı/kazanım daha)</w:t>
             </w:r>
           </w:p>
         </w:tc>
@@ -10658,7 +10658,7 @@
                 <w:sz w:val="14"/>
                 <w:szCs w:val="14"/>
               </w:rPr>
-              <w:t xml:space="preserve">Deniz, yönlendirici sorular sorulduğunda “Roman” ünitesi kapsamındaki sadeleştirilmiş bir metni okuyarak konusunu ve ana fikrini söyler. (Ölçüt: %80 – 4/5)</w:t>
+              <w:t xml:space="preserve">Deniz, yönlendirici sorular sorulduğunda “Roman” ünitesi kapsamında öğrendiklerini kısa bir sözlü ya da yazılı anlatımla paylaşır. (Ölçüt: %80 – 4/5)</w:t>
             </w:r>
           </w:p>
         </w:tc>
@@ -10951,7 +10951,7 @@
                 <w:sz w:val="14"/>
                 <w:szCs w:val="14"/>
               </w:rPr>
-              <w:t xml:space="preserve">Deniz, sadeleştirilmiş materyal verildiğinde “Roman” ünitesi kapsamında öğrendiklerini kısa bir sözlü ya da yazılı anlatımla paylaşır. (Ölçüt: %80 – 4/5)</w:t>
+              <w:t xml:space="preserve">Deniz, sadeleştirilmiş materyal verildiğinde önceki haftalarda öğrendiklerini akranına bir örnekle açıklar. (Ölçüt: %80 – 4/5)</w:t>
             </w:r>
           </w:p>
         </w:tc>
@@ -11204,7 +11204,7 @@
               </w:rPr>
               <w:t xml:space="preserve">A.3.1. Metinde geçen kelime ve kelime gruplarının anlamlarını tespit eder. A.3 2. Metnin türünün ortaya çıkışı ve tarihsel dönem ile ilişkisini…</w:t>
               <w:br/>
-              <w:t xml:space="preserve">(+3 öğrenme çıktısı/kazanım daha)</w:t>
+              <w:t xml:space="preserve">(+11 öğrenme çıktısı/kazanım daha)</w:t>
             </w:r>
           </w:p>
         </w:tc>
@@ -11570,7 +11570,7 @@
               </w:rPr>
               <w:t xml:space="preserve">A.3.1. Metinde geçen kelime ve kelime gruplarının anlamlarını tespit eder. A.3 2. Metnin türünün ortaya çıkışı ve tarihsel dönem ile ilişkisini…</w:t>
               <w:br/>
-              <w:t xml:space="preserve">(+3 öğrenme çıktısı/kazanım daha)</w:t>
+              <w:t xml:space="preserve">(+11 öğrenme çıktısı/kazanım daha)</w:t>
             </w:r>
           </w:p>
         </w:tc>
@@ -12228,7 +12228,7 @@
                 <w:sz w:val="14"/>
                 <w:szCs w:val="14"/>
               </w:rPr>
-              <w:t xml:space="preserve">Deniz, örnek bir uygulamayı inceledikten sonra “Tiyatro” ünitesi kapsamındaki sadeleştirilmiş bir metni okuyarak konusunu ve ana fikrini söyler. (Ölçüt: %80 – 4/5)</w:t>
+              <w:t xml:space="preserve">Deniz, örnek bir uygulamayı inceledikten sonra önceki haftalarda öğrendiklerini kısa bir değerlendirme etkinliğinde gösterir. (Ölçüt: %80 – 4/5)</w:t>
             </w:r>
           </w:p>
         </w:tc>
@@ -12481,7 +12481,7 @@
               </w:rPr>
               <w:t xml:space="preserve">A.4.1. Metinde geçen kelime ve kelime gruplarının anlamlarını tespit eder.</w:t>
               <w:br/>
-              <w:t xml:space="preserve">(+3 öğrenme çıktısı/kazanım daha)</w:t>
+              <w:t xml:space="preserve">(+14 öğrenme çıktısı/kazanım daha)</w:t>
             </w:r>
           </w:p>
         </w:tc>
@@ -12581,13 +12581,13 @@
               </w:rPr>
               <w:t xml:space="preserve">• Somutlaştırma</w:t>
               <w:br/>
-              <w:t xml:space="preserve">• Soru-Cevap Tekniği</w:t>
-              <w:br/>
-              <w:t xml:space="preserve">• Hikâye/Metin Haritası</w:t>
-              <w:br/>
-              <w:t xml:space="preserve">• Sadeleştirilmiş Metin</w:t>
-              <w:br/>
-              <w:t xml:space="preserve">• Kelime Kartları</w:t>
+              <w:t xml:space="preserve">• Doğrudan Anlatım</w:t>
+              <w:br/>
+              <w:t xml:space="preserve">• Gösterip Yaptırma</w:t>
+              <w:br/>
+              <w:t xml:space="preserve">• Çalışma Kâğıdı</w:t>
+              <w:br/>
+              <w:t xml:space="preserve">• Yazım Kılavuzu Föyü</w:t>
               <w:br/>
               <w:t xml:space="preserve">• Somut Materyaller</w:t>
             </w:r>
@@ -12890,7 +12890,7 @@
                 <w:sz w:val="14"/>
                 <w:szCs w:val="14"/>
               </w:rPr>
-              <w:t xml:space="preserve">Deniz, sadeleştirilmiş materyal verildiğinde ““Deneme”” ünitesi kapsamında verilen yazma şablonunu kullanarak üç-dört cümlelik bir metin yazar. (Ölçüt: %80 – 4/5)</w:t>
+              <w:t xml:space="preserve">Deniz, sadeleştirilmiş materyal verildiğinde “Deneme” ünitesi kapsamında verilen yazma şablonunu kullanarak üç-dört cümlelik bir metin yazar. (Ölçüt: %80 – 4/5)</w:t>
             </w:r>
           </w:p>
         </w:tc>
@@ -13204,7 +13204,7 @@
               </w:rPr>
               <w:t xml:space="preserve">A.4.1. Metinde geçen kelime ve kelime gruplarının anlamlarını tespit eder.</w:t>
               <w:br/>
-              <w:t xml:space="preserve">(+3 öğrenme çıktısı/kazanım daha)</w:t>
+              <w:t xml:space="preserve">(+13 öğrenme çıktısı/kazanım daha)</w:t>
             </w:r>
           </w:p>
         </w:tc>
@@ -13858,7 +13858,7 @@
                 <w:sz w:val="14"/>
                 <w:szCs w:val="14"/>
               </w:rPr>
-              <w:t xml:space="preserve">Deniz, sadeleştirilmiş materyal verildiğinde ““Söylev (Nutuk)”” ünitesi kapsamında verilen yazma şablonunu kullanarak üç-dört cümlelik bir metin yazar. (Ölçüt: %80 – 4/5)</w:t>
+              <w:t xml:space="preserve">Deniz, sadeleştirilmiş materyal verildiğinde “Söylev (Nutuk)” ünitesi kapsamında verilen yazma şablonunu kullanarak üç-dört cümlelik bir metin yazar. (Ölçüt: %80 – 4/5)</w:t>
             </w:r>
           </w:p>
         </w:tc>

</xml_diff>